<commit_message>
Se actualiza documentación proyecto
</commit_message>
<xml_diff>
--- a/Documentación/Documentación photo bogotá.docx
+++ b/Documentación/Documentación photo bogotá.docx
@@ -698,7 +698,62 @@
         <w:rPr>
           <w:rtl w:val="0"/>
         </w:rPr>
-        <w:t xml:space="preserve">El proyecto presenta limitaciones geográficas importantes al enfocarse exclusivamente en el área metropolitana de Bogotá D.C., excluyendo municipios circundantes como Soacha, Chía, La Calera, entre otros. Desde el aspecto técnico, la aplicación estará restringida a una resolución máxima de imágenes de 720p y su capacidad de almacenamiento dependerá de los recursos del servidor contratado. En términos operacionales, la actualización y enriquecimiento del contenido estará sujeto a la participación activa de la comunidad de usuarios,</w:t>
+        <w:t xml:space="preserve">El proyecto presenta limitaciones geográficas importantes al enfocarse exclusivamente en el área metropolitana de Bogotá D.C., excluyendo municipios circundantes como Soacha, Chía, La Calera, entre otros.</w:t>
+      </w:r>
+    </w:p>
+    <w:p>
+      <w:pPr>
+        <w:spacing w:after="240" w:before="240" w:lineRule="auto"/>
+        <w:jc w:val="both"/>
+        <w:rPr/>
+      </w:pPr>
+      <w:r>
+        <w:rPr>
+          <w:rtl w:val="0"/>
+        </w:rPr>
+        <w:t xml:space="preserve">Desde el aspecto técnico, la aplicación estará restringida a una resolución máxima de imágenes de 720p y su capacidad de almacenamiento dependerá de los recursos del servidor contratado.</w:t>
+      </w:r>
+    </w:p>
+    <w:p>
+      <w:pPr>
+        <w:spacing w:after="240" w:before="240" w:lineRule="auto"/>
+        <w:jc w:val="both"/>
+        <w:rPr/>
+      </w:pPr>
+      <w:r>
+        <w:rPr>
+          <w:rtl w:val="0"/>
+        </w:rPr>
+        <w:t xml:space="preserve">En términos operacionales, la actualización y enriquecimiento del contenido estará sujeto a la participación activa de la comunidad de usuarios.</w:t>
+      </w:r>
+    </w:p>
+    <w:p>
+      <w:pPr>
+        <w:spacing w:after="240" w:before="240" w:lineRule="auto"/>
+        <w:jc w:val="both"/>
+        <w:rPr/>
+      </w:pPr>
+      <w:r>
+        <w:rPr>
+          <w:rtl w:val="0"/>
+        </w:rPr>
+        <w:t xml:space="preserve">Asimismo, la aplicación no funcionará como una red social, por lo que no habrá botones de “seguir” ni funciones similares.</w:t>
+      </w:r>
+      <w:r>
+        <w:rPr>
+          <w:rtl w:val="0"/>
+        </w:rPr>
+      </w:r>
+    </w:p>
+    <w:p>
+      <w:pPr>
+        <w:jc w:val="both"/>
+        <w:rPr/>
+      </w:pPr>
+      <w:r>
+        <w:rPr>
+          <w:rtl w:val="0"/>
+        </w:rPr>
       </w:r>
     </w:p>
     <w:p>

</xml_diff>